<commit_message>
Consistency audit: fix Warsh duration rounding (3.78 -> 3.77 h) so per-riwayah hours sum to the reported 11.17 h; caption rounding note
Co-authored-by: arena-agent <297053741+arena-agent@users.noreply.github.com>
</commit_message>
<xml_diff>
--- a/build/manuscript_editable.docx
+++ b/build/manuscript_editable.docx
@@ -1245,7 +1245,7 @@
         <w:pStyle w:val="Heading3"/>
       </w:pPr>
       <w:r>
-        <w:t>Composition of the verse-level corpus by riwayah.</w:t>
+        <w:t>Composition of the verse-level corpus by riwayah. Row hours are rounded from unrounded totals, so components may differ from the total in the last digit.</w:t>
       </w:r>
     </w:p>
     <w:tbl>
@@ -1402,7 +1402,7 @@
           </w:tcPr>
           <w:p>
             <w:r>
-              <w:t>3.78</w:t>
+              <w:t>3.77</w:t>
             </w:r>
           </w:p>
         </w:tc>

</xml_diff>